<commit_message>
feat(lab6): report final commit
</commit_message>
<xml_diff>
--- a/lab6/lab6.docx
+++ b/lab6/lab6.docx
@@ -609,14 +609,25 @@
           <w:lang w:val="uk-UA"/>
         </w:rPr>
       </w:pPr>
-      <w:r>
-        <w:rPr>
-          <w:color w:val="000000"/>
-          <w:sz w:val="28"/>
-          <w:szCs w:val="28"/>
-          <w:lang w:val="uk-UA"/>
-        </w:rPr>
-        <w:t>Зарічковий О. А.</w:t>
+      <w:proofErr w:type="spellStart"/>
+      <w:r>
+        <w:rPr>
+          <w:color w:val="000000"/>
+          <w:sz w:val="28"/>
+          <w:szCs w:val="28"/>
+          <w:lang w:val="uk-UA"/>
+        </w:rPr>
+        <w:t>Зарічковий</w:t>
+      </w:r>
+      <w:proofErr w:type="spellEnd"/>
+      <w:r>
+        <w:rPr>
+          <w:color w:val="000000"/>
+          <w:sz w:val="28"/>
+          <w:szCs w:val="28"/>
+          <w:lang w:val="uk-UA"/>
+        </w:rPr>
+        <w:t xml:space="preserve"> О. А.</w:t>
       </w:r>
     </w:p>
     <w:p>
@@ -1037,7 +1048,24 @@
           <w:sz w:val="28"/>
           <w:szCs w:val="28"/>
         </w:rPr>
-        <w:t>Вкажіть, які патерни вокористовуються.</w:t>
+        <w:t>Вкажіть, які патерни в</w:t>
+      </w:r>
+      <w:r>
+        <w:rPr>
+          <w:color w:val="000000"/>
+          <w:sz w:val="28"/>
+          <w:szCs w:val="28"/>
+          <w:lang w:val="uk-UA"/>
+        </w:rPr>
+        <w:t>и</w:t>
+      </w:r>
+      <w:r>
+        <w:rPr>
+          <w:color w:val="000000"/>
+          <w:sz w:val="28"/>
+          <w:szCs w:val="28"/>
+        </w:rPr>
+        <w:t>користовуються.</w:t>
       </w:r>
     </w:p>
     <w:p>
@@ -1134,11 +1162,512 @@
           <w:szCs w:val="28"/>
           <w:lang w:val="uk-UA"/>
         </w:rPr>
-        <w:t>На основі архітектури стрімінгового сервісу музики та подкастів, визначено наступні потенційні точки відмови. Система складається з мікросервісів (Streaming Service, User Service, Search Service, Recommendations Service, Payments Service, Analytics Service, Emails Service, Playlists Service, Lyrics Service), баз даних (PostgreSQL, Redis), системи обміну повідомленнями (Kafka), зовнішніх систем (Musixmatch, платіжні сервіси) та API Gateway.</w:t>
-      </w:r>
-    </w:p>
-    <w:p>
-      <w:pPr>
+        <w:t xml:space="preserve">На основі архітектури </w:t>
+      </w:r>
+      <w:proofErr w:type="spellStart"/>
+      <w:r>
+        <w:rPr>
+          <w:color w:val="000000"/>
+          <w:sz w:val="28"/>
+          <w:szCs w:val="28"/>
+          <w:lang w:val="uk-UA"/>
+        </w:rPr>
+        <w:t>стрімінгового</w:t>
+      </w:r>
+      <w:proofErr w:type="spellEnd"/>
+      <w:r>
+        <w:rPr>
+          <w:color w:val="000000"/>
+          <w:sz w:val="28"/>
+          <w:szCs w:val="28"/>
+          <w:lang w:val="uk-UA"/>
+        </w:rPr>
+        <w:t xml:space="preserve"> сервісу музики та подкастів, визначено наступні потенційні точки відмови. Система складається з </w:t>
+      </w:r>
+      <w:proofErr w:type="spellStart"/>
+      <w:r>
+        <w:rPr>
+          <w:color w:val="000000"/>
+          <w:sz w:val="28"/>
+          <w:szCs w:val="28"/>
+          <w:lang w:val="uk-UA"/>
+        </w:rPr>
+        <w:t>мікросервісів</w:t>
+      </w:r>
+      <w:proofErr w:type="spellEnd"/>
+      <w:r>
+        <w:rPr>
+          <w:color w:val="000000"/>
+          <w:sz w:val="28"/>
+          <w:szCs w:val="28"/>
+          <w:lang w:val="uk-UA"/>
+        </w:rPr>
+        <w:t xml:space="preserve"> (</w:t>
+      </w:r>
+      <w:proofErr w:type="spellStart"/>
+      <w:r>
+        <w:rPr>
+          <w:color w:val="000000"/>
+          <w:sz w:val="28"/>
+          <w:szCs w:val="28"/>
+          <w:lang w:val="uk-UA"/>
+        </w:rPr>
+        <w:t>Streaming</w:t>
+      </w:r>
+      <w:proofErr w:type="spellEnd"/>
+      <w:r>
+        <w:rPr>
+          <w:color w:val="000000"/>
+          <w:sz w:val="28"/>
+          <w:szCs w:val="28"/>
+          <w:lang w:val="uk-UA"/>
+        </w:rPr>
+        <w:t xml:space="preserve"> </w:t>
+      </w:r>
+      <w:proofErr w:type="spellStart"/>
+      <w:r>
+        <w:rPr>
+          <w:color w:val="000000"/>
+          <w:sz w:val="28"/>
+          <w:szCs w:val="28"/>
+          <w:lang w:val="uk-UA"/>
+        </w:rPr>
+        <w:t>Service</w:t>
+      </w:r>
+      <w:proofErr w:type="spellEnd"/>
+      <w:r>
+        <w:rPr>
+          <w:color w:val="000000"/>
+          <w:sz w:val="28"/>
+          <w:szCs w:val="28"/>
+          <w:lang w:val="uk-UA"/>
+        </w:rPr>
+        <w:t xml:space="preserve">, </w:t>
+      </w:r>
+      <w:proofErr w:type="spellStart"/>
+      <w:r>
+        <w:rPr>
+          <w:color w:val="000000"/>
+          <w:sz w:val="28"/>
+          <w:szCs w:val="28"/>
+          <w:lang w:val="uk-UA"/>
+        </w:rPr>
+        <w:t>User</w:t>
+      </w:r>
+      <w:proofErr w:type="spellEnd"/>
+      <w:r>
+        <w:rPr>
+          <w:color w:val="000000"/>
+          <w:sz w:val="28"/>
+          <w:szCs w:val="28"/>
+          <w:lang w:val="uk-UA"/>
+        </w:rPr>
+        <w:t xml:space="preserve"> </w:t>
+      </w:r>
+      <w:proofErr w:type="spellStart"/>
+      <w:r>
+        <w:rPr>
+          <w:color w:val="000000"/>
+          <w:sz w:val="28"/>
+          <w:szCs w:val="28"/>
+          <w:lang w:val="uk-UA"/>
+        </w:rPr>
+        <w:t>Service</w:t>
+      </w:r>
+      <w:proofErr w:type="spellEnd"/>
+      <w:r>
+        <w:rPr>
+          <w:color w:val="000000"/>
+          <w:sz w:val="28"/>
+          <w:szCs w:val="28"/>
+          <w:lang w:val="uk-UA"/>
+        </w:rPr>
+        <w:t xml:space="preserve">, </w:t>
+      </w:r>
+      <w:proofErr w:type="spellStart"/>
+      <w:r>
+        <w:rPr>
+          <w:color w:val="000000"/>
+          <w:sz w:val="28"/>
+          <w:szCs w:val="28"/>
+          <w:lang w:val="uk-UA"/>
+        </w:rPr>
+        <w:t>Search</w:t>
+      </w:r>
+      <w:proofErr w:type="spellEnd"/>
+      <w:r>
+        <w:rPr>
+          <w:color w:val="000000"/>
+          <w:sz w:val="28"/>
+          <w:szCs w:val="28"/>
+          <w:lang w:val="uk-UA"/>
+        </w:rPr>
+        <w:t xml:space="preserve"> </w:t>
+      </w:r>
+      <w:proofErr w:type="spellStart"/>
+      <w:r>
+        <w:rPr>
+          <w:color w:val="000000"/>
+          <w:sz w:val="28"/>
+          <w:szCs w:val="28"/>
+          <w:lang w:val="uk-UA"/>
+        </w:rPr>
+        <w:t>Service</w:t>
+      </w:r>
+      <w:proofErr w:type="spellEnd"/>
+      <w:r>
+        <w:rPr>
+          <w:color w:val="000000"/>
+          <w:sz w:val="28"/>
+          <w:szCs w:val="28"/>
+          <w:lang w:val="uk-UA"/>
+        </w:rPr>
+        <w:t xml:space="preserve">, </w:t>
+      </w:r>
+      <w:proofErr w:type="spellStart"/>
+      <w:r>
+        <w:rPr>
+          <w:color w:val="000000"/>
+          <w:sz w:val="28"/>
+          <w:szCs w:val="28"/>
+          <w:lang w:val="uk-UA"/>
+        </w:rPr>
+        <w:t>Recommendations</w:t>
+      </w:r>
+      <w:proofErr w:type="spellEnd"/>
+      <w:r>
+        <w:rPr>
+          <w:color w:val="000000"/>
+          <w:sz w:val="28"/>
+          <w:szCs w:val="28"/>
+          <w:lang w:val="uk-UA"/>
+        </w:rPr>
+        <w:t xml:space="preserve"> </w:t>
+      </w:r>
+      <w:proofErr w:type="spellStart"/>
+      <w:r>
+        <w:rPr>
+          <w:color w:val="000000"/>
+          <w:sz w:val="28"/>
+          <w:szCs w:val="28"/>
+          <w:lang w:val="uk-UA"/>
+        </w:rPr>
+        <w:t>Service</w:t>
+      </w:r>
+      <w:proofErr w:type="spellEnd"/>
+      <w:r>
+        <w:rPr>
+          <w:color w:val="000000"/>
+          <w:sz w:val="28"/>
+          <w:szCs w:val="28"/>
+          <w:lang w:val="uk-UA"/>
+        </w:rPr>
+        <w:t xml:space="preserve">, </w:t>
+      </w:r>
+      <w:proofErr w:type="spellStart"/>
+      <w:r>
+        <w:rPr>
+          <w:color w:val="000000"/>
+          <w:sz w:val="28"/>
+          <w:szCs w:val="28"/>
+          <w:lang w:val="uk-UA"/>
+        </w:rPr>
+        <w:t>Payments</w:t>
+      </w:r>
+      <w:proofErr w:type="spellEnd"/>
+      <w:r>
+        <w:rPr>
+          <w:color w:val="000000"/>
+          <w:sz w:val="28"/>
+          <w:szCs w:val="28"/>
+          <w:lang w:val="uk-UA"/>
+        </w:rPr>
+        <w:t xml:space="preserve"> </w:t>
+      </w:r>
+      <w:proofErr w:type="spellStart"/>
+      <w:r>
+        <w:rPr>
+          <w:color w:val="000000"/>
+          <w:sz w:val="28"/>
+          <w:szCs w:val="28"/>
+          <w:lang w:val="uk-UA"/>
+        </w:rPr>
+        <w:t>Service</w:t>
+      </w:r>
+      <w:proofErr w:type="spellEnd"/>
+      <w:r>
+        <w:rPr>
+          <w:color w:val="000000"/>
+          <w:sz w:val="28"/>
+          <w:szCs w:val="28"/>
+          <w:lang w:val="uk-UA"/>
+        </w:rPr>
+        <w:t xml:space="preserve">, </w:t>
+      </w:r>
+      <w:proofErr w:type="spellStart"/>
+      <w:r>
+        <w:rPr>
+          <w:color w:val="000000"/>
+          <w:sz w:val="28"/>
+          <w:szCs w:val="28"/>
+          <w:lang w:val="uk-UA"/>
+        </w:rPr>
+        <w:t>Analytics</w:t>
+      </w:r>
+      <w:proofErr w:type="spellEnd"/>
+      <w:r>
+        <w:rPr>
+          <w:color w:val="000000"/>
+          <w:sz w:val="28"/>
+          <w:szCs w:val="28"/>
+          <w:lang w:val="uk-UA"/>
+        </w:rPr>
+        <w:t xml:space="preserve"> </w:t>
+      </w:r>
+      <w:proofErr w:type="spellStart"/>
+      <w:r>
+        <w:rPr>
+          <w:color w:val="000000"/>
+          <w:sz w:val="28"/>
+          <w:szCs w:val="28"/>
+          <w:lang w:val="uk-UA"/>
+        </w:rPr>
+        <w:t>Service</w:t>
+      </w:r>
+      <w:proofErr w:type="spellEnd"/>
+      <w:r>
+        <w:rPr>
+          <w:color w:val="000000"/>
+          <w:sz w:val="28"/>
+          <w:szCs w:val="28"/>
+          <w:lang w:val="uk-UA"/>
+        </w:rPr>
+        <w:t xml:space="preserve">, </w:t>
+      </w:r>
+      <w:proofErr w:type="spellStart"/>
+      <w:r>
+        <w:rPr>
+          <w:color w:val="000000"/>
+          <w:sz w:val="28"/>
+          <w:szCs w:val="28"/>
+          <w:lang w:val="uk-UA"/>
+        </w:rPr>
+        <w:t>Emails</w:t>
+      </w:r>
+      <w:proofErr w:type="spellEnd"/>
+      <w:r>
+        <w:rPr>
+          <w:color w:val="000000"/>
+          <w:sz w:val="28"/>
+          <w:szCs w:val="28"/>
+          <w:lang w:val="uk-UA"/>
+        </w:rPr>
+        <w:t xml:space="preserve"> </w:t>
+      </w:r>
+      <w:proofErr w:type="spellStart"/>
+      <w:r>
+        <w:rPr>
+          <w:color w:val="000000"/>
+          <w:sz w:val="28"/>
+          <w:szCs w:val="28"/>
+          <w:lang w:val="uk-UA"/>
+        </w:rPr>
+        <w:t>Service</w:t>
+      </w:r>
+      <w:proofErr w:type="spellEnd"/>
+      <w:r>
+        <w:rPr>
+          <w:color w:val="000000"/>
+          <w:sz w:val="28"/>
+          <w:szCs w:val="28"/>
+          <w:lang w:val="uk-UA"/>
+        </w:rPr>
+        <w:t xml:space="preserve">, </w:t>
+      </w:r>
+      <w:proofErr w:type="spellStart"/>
+      <w:r>
+        <w:rPr>
+          <w:color w:val="000000"/>
+          <w:sz w:val="28"/>
+          <w:szCs w:val="28"/>
+          <w:lang w:val="uk-UA"/>
+        </w:rPr>
+        <w:t>Playlists</w:t>
+      </w:r>
+      <w:proofErr w:type="spellEnd"/>
+      <w:r>
+        <w:rPr>
+          <w:color w:val="000000"/>
+          <w:sz w:val="28"/>
+          <w:szCs w:val="28"/>
+          <w:lang w:val="uk-UA"/>
+        </w:rPr>
+        <w:t xml:space="preserve"> </w:t>
+      </w:r>
+      <w:proofErr w:type="spellStart"/>
+      <w:r>
+        <w:rPr>
+          <w:color w:val="000000"/>
+          <w:sz w:val="28"/>
+          <w:szCs w:val="28"/>
+          <w:lang w:val="uk-UA"/>
+        </w:rPr>
+        <w:t>Service</w:t>
+      </w:r>
+      <w:proofErr w:type="spellEnd"/>
+      <w:r>
+        <w:rPr>
+          <w:color w:val="000000"/>
+          <w:sz w:val="28"/>
+          <w:szCs w:val="28"/>
+          <w:lang w:val="uk-UA"/>
+        </w:rPr>
+        <w:t xml:space="preserve">, </w:t>
+      </w:r>
+      <w:proofErr w:type="spellStart"/>
+      <w:r>
+        <w:rPr>
+          <w:color w:val="000000"/>
+          <w:sz w:val="28"/>
+          <w:szCs w:val="28"/>
+          <w:lang w:val="uk-UA"/>
+        </w:rPr>
+        <w:t>Lyrics</w:t>
+      </w:r>
+      <w:proofErr w:type="spellEnd"/>
+      <w:r>
+        <w:rPr>
+          <w:color w:val="000000"/>
+          <w:sz w:val="28"/>
+          <w:szCs w:val="28"/>
+          <w:lang w:val="uk-UA"/>
+        </w:rPr>
+        <w:t xml:space="preserve"> </w:t>
+      </w:r>
+      <w:proofErr w:type="spellStart"/>
+      <w:r>
+        <w:rPr>
+          <w:color w:val="000000"/>
+          <w:sz w:val="28"/>
+          <w:szCs w:val="28"/>
+          <w:lang w:val="uk-UA"/>
+        </w:rPr>
+        <w:t>Service</w:t>
+      </w:r>
+      <w:proofErr w:type="spellEnd"/>
+      <w:r>
+        <w:rPr>
+          <w:color w:val="000000"/>
+          <w:sz w:val="28"/>
+          <w:szCs w:val="28"/>
+          <w:lang w:val="uk-UA"/>
+        </w:rPr>
+        <w:t>), баз даних (</w:t>
+      </w:r>
+      <w:proofErr w:type="spellStart"/>
+      <w:r>
+        <w:rPr>
+          <w:color w:val="000000"/>
+          <w:sz w:val="28"/>
+          <w:szCs w:val="28"/>
+          <w:lang w:val="uk-UA"/>
+        </w:rPr>
+        <w:t>PostgreSQL</w:t>
+      </w:r>
+      <w:proofErr w:type="spellEnd"/>
+      <w:r>
+        <w:rPr>
+          <w:color w:val="000000"/>
+          <w:sz w:val="28"/>
+          <w:szCs w:val="28"/>
+          <w:lang w:val="uk-UA"/>
+        </w:rPr>
+        <w:t xml:space="preserve">, </w:t>
+      </w:r>
+      <w:proofErr w:type="spellStart"/>
+      <w:r>
+        <w:rPr>
+          <w:color w:val="000000"/>
+          <w:sz w:val="28"/>
+          <w:szCs w:val="28"/>
+          <w:lang w:val="uk-UA"/>
+        </w:rPr>
+        <w:t>Redis</w:t>
+      </w:r>
+      <w:proofErr w:type="spellEnd"/>
+      <w:r>
+        <w:rPr>
+          <w:color w:val="000000"/>
+          <w:sz w:val="28"/>
+          <w:szCs w:val="28"/>
+          <w:lang w:val="uk-UA"/>
+        </w:rPr>
+        <w:t>), системи обміну повідомленнями (</w:t>
+      </w:r>
+      <w:proofErr w:type="spellStart"/>
+      <w:r>
+        <w:rPr>
+          <w:color w:val="000000"/>
+          <w:sz w:val="28"/>
+          <w:szCs w:val="28"/>
+          <w:lang w:val="uk-UA"/>
+        </w:rPr>
+        <w:t>Kafka</w:t>
+      </w:r>
+      <w:proofErr w:type="spellEnd"/>
+      <w:r>
+        <w:rPr>
+          <w:color w:val="000000"/>
+          <w:sz w:val="28"/>
+          <w:szCs w:val="28"/>
+          <w:lang w:val="uk-UA"/>
+        </w:rPr>
+        <w:t>), зовнішніх систем (</w:t>
+      </w:r>
+      <w:proofErr w:type="spellStart"/>
+      <w:r>
+        <w:rPr>
+          <w:color w:val="000000"/>
+          <w:sz w:val="28"/>
+          <w:szCs w:val="28"/>
+          <w:lang w:val="uk-UA"/>
+        </w:rPr>
+        <w:t>Musixmatch</w:t>
+      </w:r>
+      <w:proofErr w:type="spellEnd"/>
+      <w:r>
+        <w:rPr>
+          <w:color w:val="000000"/>
+          <w:sz w:val="28"/>
+          <w:szCs w:val="28"/>
+          <w:lang w:val="uk-UA"/>
+        </w:rPr>
+        <w:t xml:space="preserve">, платіжні сервіси) та API </w:t>
+      </w:r>
+      <w:proofErr w:type="spellStart"/>
+      <w:r>
+        <w:rPr>
+          <w:color w:val="000000"/>
+          <w:sz w:val="28"/>
+          <w:szCs w:val="28"/>
+          <w:lang w:val="uk-UA"/>
+        </w:rPr>
+        <w:t>Gateway</w:t>
+      </w:r>
+      <w:proofErr w:type="spellEnd"/>
+      <w:r>
+        <w:rPr>
+          <w:color w:val="000000"/>
+          <w:sz w:val="28"/>
+          <w:szCs w:val="28"/>
+          <w:lang w:val="uk-UA"/>
+        </w:rPr>
+        <w:t>.</w:t>
+      </w:r>
+    </w:p>
+    <w:p>
+      <w:pPr>
+        <w:spacing w:line="360" w:lineRule="auto"/>
         <w:rPr>
           <w:color w:val="000000"/>
           <w:sz w:val="28"/>
@@ -2139,6 +2668,7 @@
     </w:p>
     <w:p>
       <w:pPr>
+        <w:spacing w:line="360" w:lineRule="auto"/>
         <w:rPr>
           <w:color w:val="000000"/>
           <w:sz w:val="28"/>
@@ -2909,6 +3439,7 @@
           <w:color w:val="000000"/>
           <w:sz w:val="28"/>
           <w:szCs w:val="28"/>
+          <w:lang w:val="uk-UA"/>
         </w:rPr>
       </w:pPr>
       <w:r>
@@ -2928,22 +3459,246 @@
           <w:sz w:val="28"/>
           <w:szCs w:val="28"/>
         </w:rPr>
-        <w:t xml:space="preserve"> Дозволяє обробити 80-90% запитів при короткочасних збоях, зберігаючи лояльність користувачів без значних інвестицій.</w:t>
+        <w:t xml:space="preserve"> Дозволяє обробити 80-90% запитів при короткочасних збоях, зберігаючи лояльність користувачів без значних інвестицій</w:t>
+      </w:r>
+      <w:r>
+        <w:rPr>
+          <w:color w:val="000000"/>
+          <w:sz w:val="28"/>
+          <w:szCs w:val="28"/>
+          <w:lang w:val="uk-UA"/>
+        </w:rPr>
+        <w:t>.</w:t>
       </w:r>
     </w:p>
     <w:p>
       <w:pPr>
         <w:spacing w:line="360" w:lineRule="auto"/>
+        <w:ind w:firstLine="709"/>
         <w:jc w:val="both"/>
         <w:rPr>
-          <w:color w:val="000000"/>
-          <w:sz w:val="28"/>
-          <w:szCs w:val="28"/>
-        </w:rPr>
-      </w:pPr>
-    </w:p>
-    <w:p>
-      <w:pPr>
+          <w:b/>
+          <w:bCs/>
+          <w:color w:val="000000"/>
+          <w:sz w:val="28"/>
+          <w:szCs w:val="28"/>
+          <w:lang w:val="uk-UA"/>
+        </w:rPr>
+      </w:pPr>
+      <w:r>
+        <w:rPr>
+          <w:b/>
+          <w:bCs/>
+          <w:color w:val="000000"/>
+          <w:sz w:val="28"/>
+          <w:szCs w:val="28"/>
+          <w:lang w:val="uk-UA"/>
+        </w:rPr>
+        <w:t>4.</w:t>
+      </w:r>
+      <w:r>
+        <w:rPr>
+          <w:b/>
+          <w:bCs/>
+          <w:color w:val="000000"/>
+          <w:sz w:val="28"/>
+          <w:szCs w:val="28"/>
+          <w:lang w:val="uk-UA"/>
+        </w:rPr>
+        <w:tab/>
+        <w:t>Діаграма послідовності</w:t>
+      </w:r>
+    </w:p>
+    <w:p>
+      <w:pPr>
+        <w:spacing w:line="360" w:lineRule="auto"/>
+        <w:ind w:firstLine="709"/>
+        <w:jc w:val="both"/>
+        <w:rPr>
+          <w:b/>
+          <w:bCs/>
+          <w:color w:val="000000"/>
+          <w:sz w:val="28"/>
+          <w:szCs w:val="28"/>
+          <w:lang w:val="uk-UA"/>
+        </w:rPr>
+      </w:pPr>
+      <w:r>
+        <w:rPr>
+          <w:b/>
+          <w:bCs/>
+          <w:noProof/>
+          <w:color w:val="000000"/>
+          <w:sz w:val="28"/>
+          <w:szCs w:val="28"/>
+          <w:lang w:val="uk-UA"/>
+        </w:rPr>
+        <w:drawing>
+          <wp:inline distT="0" distB="0" distL="0" distR="0" wp14:anchorId="0F313E4A" wp14:editId="2B9880D4">
+            <wp:extent cx="5731510" cy="5640705"/>
+            <wp:effectExtent l="0" t="0" r="0" b="0"/>
+            <wp:docPr id="1" name="Picture 1"/>
+            <wp:cNvGraphicFramePr>
+              <a:graphicFrameLocks xmlns:a="http://schemas.openxmlformats.org/drawingml/2006/main" noChangeAspect="1"/>
+            </wp:cNvGraphicFramePr>
+            <a:graphic xmlns:a="http://schemas.openxmlformats.org/drawingml/2006/main">
+              <a:graphicData uri="http://schemas.openxmlformats.org/drawingml/2006/picture">
+                <pic:pic xmlns:pic="http://schemas.openxmlformats.org/drawingml/2006/picture">
+                  <pic:nvPicPr>
+                    <pic:cNvPr id="1" name="Picture 1"/>
+                    <pic:cNvPicPr/>
+                  </pic:nvPicPr>
+                  <pic:blipFill>
+                    <a:blip r:embed="rId7">
+                      <a:extLst>
+                        <a:ext uri="{28A0092B-C50C-407E-A947-70E740481C1C}">
+                          <a14:useLocalDpi xmlns:a14="http://schemas.microsoft.com/office/drawing/2010/main" val="0"/>
+                        </a:ext>
+                      </a:extLst>
+                    </a:blip>
+                    <a:stretch>
+                      <a:fillRect/>
+                    </a:stretch>
+                  </pic:blipFill>
+                  <pic:spPr>
+                    <a:xfrm>
+                      <a:off x="0" y="0"/>
+                      <a:ext cx="5731510" cy="5640705"/>
+                    </a:xfrm>
+                    <a:prstGeom prst="rect">
+                      <a:avLst/>
+                    </a:prstGeom>
+                  </pic:spPr>
+                </pic:pic>
+              </a:graphicData>
+            </a:graphic>
+          </wp:inline>
+        </w:drawing>
+      </w:r>
+    </w:p>
+    <w:p>
+      <w:pPr>
+        <w:spacing w:line="360" w:lineRule="auto"/>
+        <w:ind w:firstLine="709"/>
+        <w:jc w:val="center"/>
+        <w:rPr>
+          <w:color w:val="000000"/>
+          <w:sz w:val="28"/>
+          <w:szCs w:val="28"/>
+          <w:lang w:val="uk-UA"/>
+        </w:rPr>
+      </w:pPr>
+      <w:r>
+        <w:rPr>
+          <w:color w:val="000000"/>
+          <w:sz w:val="28"/>
+          <w:szCs w:val="28"/>
+          <w:lang w:val="uk-UA"/>
+        </w:rPr>
+        <w:t>Рис. 1 – Діаграма послідовностей</w:t>
+      </w:r>
+    </w:p>
+    <w:p>
+      <w:pPr>
+        <w:spacing w:line="360" w:lineRule="auto"/>
+        <w:ind w:firstLine="709"/>
+        <w:jc w:val="both"/>
+        <w:rPr>
+          <w:b/>
+          <w:bCs/>
+          <w:color w:val="000000"/>
+          <w:sz w:val="28"/>
+          <w:szCs w:val="28"/>
+        </w:rPr>
+      </w:pPr>
+      <w:r>
+        <w:rPr>
+          <w:b/>
+          <w:bCs/>
+          <w:color w:val="000000"/>
+          <w:sz w:val="28"/>
+          <w:szCs w:val="28"/>
+        </w:rPr>
+        <w:t>Опис діаграми:</w:t>
+      </w:r>
+    </w:p>
+    <w:p>
+      <w:pPr>
+        <w:numPr>
+          <w:ilvl w:val="0"/>
+          <w:numId w:val="33"/>
+        </w:numPr>
+        <w:spacing w:line="360" w:lineRule="auto"/>
+        <w:ind w:left="0" w:firstLine="709"/>
+        <w:jc w:val="both"/>
+        <w:rPr>
+          <w:color w:val="000000"/>
+          <w:sz w:val="28"/>
+          <w:szCs w:val="28"/>
+        </w:rPr>
+      </w:pPr>
+      <w:r>
+        <w:rPr>
+          <w:b/>
+          <w:bCs/>
+          <w:color w:val="000000"/>
+          <w:sz w:val="28"/>
+          <w:szCs w:val="28"/>
+        </w:rPr>
+        <w:t>Учасники:</w:t>
+      </w:r>
+      <w:r>
+        <w:rPr>
+          <w:color w:val="000000"/>
+          <w:sz w:val="28"/>
+          <w:szCs w:val="28"/>
+        </w:rPr>
+        <w:t xml:space="preserve"> User, API Gateway, Circuit Breaker, Streaming Service, Redis.</w:t>
+      </w:r>
+    </w:p>
+    <w:p>
+      <w:pPr>
+        <w:numPr>
+          <w:ilvl w:val="0"/>
+          <w:numId w:val="33"/>
+        </w:numPr>
+        <w:spacing w:line="360" w:lineRule="auto"/>
+        <w:ind w:left="0" w:firstLine="709"/>
+        <w:jc w:val="both"/>
+        <w:rPr>
+          <w:color w:val="000000"/>
+          <w:sz w:val="28"/>
+          <w:szCs w:val="28"/>
+        </w:rPr>
+      </w:pPr>
+      <w:r>
+        <w:rPr>
+          <w:b/>
+          <w:bCs/>
+          <w:color w:val="000000"/>
+          <w:sz w:val="28"/>
+          <w:szCs w:val="28"/>
+        </w:rPr>
+        <w:t>Сценарій:</w:t>
+      </w:r>
+      <w:r>
+        <w:rPr>
+          <w:color w:val="000000"/>
+          <w:sz w:val="28"/>
+          <w:szCs w:val="28"/>
+        </w:rPr>
+        <w:t xml:space="preserve"> Користувач надсилає запит на відтворення треку через API Gateway. Circuit Breaker перевіряє стан: </w:t>
+      </w:r>
+    </w:p>
+    <w:p>
+      <w:pPr>
+        <w:numPr>
+          <w:ilvl w:val="1"/>
+          <w:numId w:val="33"/>
+        </w:numPr>
+        <w:tabs>
+          <w:tab w:val="clear" w:pos="1440"/>
+        </w:tabs>
         <w:spacing w:line="360" w:lineRule="auto"/>
         <w:ind w:left="709" w:firstLine="709"/>
         <w:jc w:val="both"/>
@@ -2951,9 +3706,361 @@
           <w:color w:val="000000"/>
           <w:sz w:val="28"/>
           <w:szCs w:val="28"/>
-          <w:lang w:val="uk-UA"/>
-        </w:rPr>
-      </w:pPr>
+        </w:rPr>
+      </w:pPr>
+      <w:r>
+        <w:rPr>
+          <w:color w:val="000000"/>
+          <w:sz w:val="28"/>
+          <w:szCs w:val="28"/>
+        </w:rPr>
+        <w:lastRenderedPageBreak/>
+        <w:t>Якщо коло закрите (circuit closed), робить запит до Streaming Service з 3 повторними спробами.</w:t>
+      </w:r>
+    </w:p>
+    <w:p>
+      <w:pPr>
+        <w:numPr>
+          <w:ilvl w:val="1"/>
+          <w:numId w:val="33"/>
+        </w:numPr>
+        <w:tabs>
+          <w:tab w:val="clear" w:pos="1440"/>
+        </w:tabs>
+        <w:spacing w:line="360" w:lineRule="auto"/>
+        <w:ind w:left="709" w:firstLine="709"/>
+        <w:jc w:val="both"/>
+        <w:rPr>
+          <w:color w:val="000000"/>
+          <w:sz w:val="28"/>
+          <w:szCs w:val="28"/>
+        </w:rPr>
+      </w:pPr>
+      <w:r>
+        <w:rPr>
+          <w:color w:val="000000"/>
+          <w:sz w:val="28"/>
+          <w:szCs w:val="28"/>
+        </w:rPr>
+        <w:t>При успіху повертається URL потоку.</w:t>
+      </w:r>
+    </w:p>
+    <w:p>
+      <w:pPr>
+        <w:numPr>
+          <w:ilvl w:val="1"/>
+          <w:numId w:val="33"/>
+        </w:numPr>
+        <w:tabs>
+          <w:tab w:val="clear" w:pos="1440"/>
+        </w:tabs>
+        <w:spacing w:line="360" w:lineRule="auto"/>
+        <w:ind w:left="709" w:firstLine="709"/>
+        <w:jc w:val="both"/>
+        <w:rPr>
+          <w:color w:val="000000"/>
+          <w:sz w:val="28"/>
+          <w:szCs w:val="28"/>
+        </w:rPr>
+      </w:pPr>
+      <w:r>
+        <w:rPr>
+          <w:color w:val="000000"/>
+          <w:sz w:val="28"/>
+          <w:szCs w:val="28"/>
+        </w:rPr>
+        <w:t>При невдачі звертається до Redis за кешованим URL.</w:t>
+      </w:r>
+    </w:p>
+    <w:p>
+      <w:pPr>
+        <w:numPr>
+          <w:ilvl w:val="1"/>
+          <w:numId w:val="33"/>
+        </w:numPr>
+        <w:tabs>
+          <w:tab w:val="clear" w:pos="1440"/>
+        </w:tabs>
+        <w:spacing w:line="360" w:lineRule="auto"/>
+        <w:ind w:left="709" w:firstLine="709"/>
+        <w:jc w:val="both"/>
+        <w:rPr>
+          <w:color w:val="000000"/>
+          <w:sz w:val="28"/>
+          <w:szCs w:val="28"/>
+        </w:rPr>
+      </w:pPr>
+      <w:r>
+        <w:rPr>
+          <w:color w:val="000000"/>
+          <w:sz w:val="28"/>
+          <w:szCs w:val="28"/>
+        </w:rPr>
+        <w:t>Якщо коло відкрите (circuit open), одразу перевіряє кеш.</w:t>
+      </w:r>
+    </w:p>
+    <w:p>
+      <w:pPr>
+        <w:numPr>
+          <w:ilvl w:val="1"/>
+          <w:numId w:val="33"/>
+        </w:numPr>
+        <w:tabs>
+          <w:tab w:val="clear" w:pos="1440"/>
+        </w:tabs>
+        <w:spacing w:line="360" w:lineRule="auto"/>
+        <w:ind w:left="709" w:firstLine="709"/>
+        <w:jc w:val="both"/>
+        <w:rPr>
+          <w:color w:val="000000"/>
+          <w:sz w:val="28"/>
+          <w:szCs w:val="28"/>
+        </w:rPr>
+      </w:pPr>
+      <w:r>
+        <w:rPr>
+          <w:color w:val="000000"/>
+          <w:sz w:val="28"/>
+          <w:szCs w:val="28"/>
+        </w:rPr>
+        <w:t>Якщо кеш доступний, повертається кешований URL; інакше — помилка 503.</w:t>
+      </w:r>
+    </w:p>
+    <w:p>
+      <w:pPr>
+        <w:spacing w:line="360" w:lineRule="auto"/>
+        <w:ind w:firstLine="709"/>
+        <w:jc w:val="both"/>
+        <w:rPr>
+          <w:b/>
+          <w:bCs/>
+          <w:color w:val="000000"/>
+          <w:sz w:val="28"/>
+          <w:szCs w:val="28"/>
+        </w:rPr>
+      </w:pPr>
+      <w:r>
+        <w:rPr>
+          <w:b/>
+          <w:bCs/>
+          <w:color w:val="000000"/>
+          <w:sz w:val="28"/>
+          <w:szCs w:val="28"/>
+        </w:rPr>
+        <w:t xml:space="preserve">5. </w:t>
+      </w:r>
+      <w:r>
+        <w:rPr>
+          <w:b/>
+          <w:bCs/>
+          <w:color w:val="000000"/>
+          <w:sz w:val="28"/>
+          <w:szCs w:val="28"/>
+        </w:rPr>
+        <w:tab/>
+      </w:r>
+      <w:r>
+        <w:rPr>
+          <w:b/>
+          <w:bCs/>
+          <w:color w:val="000000"/>
+          <w:sz w:val="28"/>
+          <w:szCs w:val="28"/>
+        </w:rPr>
+        <w:t>Використані патерни</w:t>
+      </w:r>
+    </w:p>
+    <w:p>
+      <w:pPr>
+        <w:numPr>
+          <w:ilvl w:val="0"/>
+          <w:numId w:val="34"/>
+        </w:numPr>
+        <w:spacing w:line="360" w:lineRule="auto"/>
+        <w:ind w:left="0" w:firstLine="709"/>
+        <w:jc w:val="both"/>
+        <w:rPr>
+          <w:color w:val="000000"/>
+          <w:sz w:val="28"/>
+          <w:szCs w:val="28"/>
+        </w:rPr>
+      </w:pPr>
+      <w:r>
+        <w:rPr>
+          <w:b/>
+          <w:bCs/>
+          <w:color w:val="000000"/>
+          <w:sz w:val="28"/>
+          <w:szCs w:val="28"/>
+        </w:rPr>
+        <w:t>Circuit Breaker Pattern</w:t>
+      </w:r>
+      <w:r>
+        <w:rPr>
+          <w:color w:val="000000"/>
+          <w:sz w:val="28"/>
+          <w:szCs w:val="28"/>
+        </w:rPr>
+        <w:t xml:space="preserve"> </w:t>
+      </w:r>
+    </w:p>
+    <w:p>
+      <w:pPr>
+        <w:spacing w:line="360" w:lineRule="auto"/>
+        <w:ind w:firstLine="709"/>
+        <w:jc w:val="both"/>
+        <w:rPr>
+          <w:color w:val="000000"/>
+          <w:sz w:val="28"/>
+          <w:szCs w:val="28"/>
+        </w:rPr>
+      </w:pPr>
+      <w:r>
+        <w:rPr>
+          <w:b/>
+          <w:bCs/>
+          <w:color w:val="000000"/>
+          <w:sz w:val="28"/>
+          <w:szCs w:val="28"/>
+        </w:rPr>
+        <w:t>Опис:</w:t>
+      </w:r>
+      <w:r>
+        <w:rPr>
+          <w:color w:val="000000"/>
+          <w:sz w:val="28"/>
+          <w:szCs w:val="28"/>
+        </w:rPr>
+        <w:t xml:space="preserve"> Запобігає каскадним збоям, дозволяючи системі переключатися на резервний сценарій при повторних невдачах Streaming Service.</w:t>
+      </w:r>
+    </w:p>
+    <w:p>
+      <w:pPr>
+        <w:numPr>
+          <w:ilvl w:val="0"/>
+          <w:numId w:val="34"/>
+        </w:numPr>
+        <w:spacing w:line="360" w:lineRule="auto"/>
+        <w:ind w:left="0" w:firstLine="709"/>
+        <w:jc w:val="both"/>
+        <w:rPr>
+          <w:color w:val="000000"/>
+          <w:sz w:val="28"/>
+          <w:szCs w:val="28"/>
+        </w:rPr>
+      </w:pPr>
+      <w:r>
+        <w:rPr>
+          <w:b/>
+          <w:bCs/>
+          <w:color w:val="000000"/>
+          <w:sz w:val="28"/>
+          <w:szCs w:val="28"/>
+        </w:rPr>
+        <w:t>Retry Pattern</w:t>
+      </w:r>
+      <w:r>
+        <w:rPr>
+          <w:color w:val="000000"/>
+          <w:sz w:val="28"/>
+          <w:szCs w:val="28"/>
+        </w:rPr>
+        <w:t xml:space="preserve"> </w:t>
+      </w:r>
+    </w:p>
+    <w:p>
+      <w:pPr>
+        <w:spacing w:line="360" w:lineRule="auto"/>
+        <w:ind w:firstLine="709"/>
+        <w:jc w:val="both"/>
+        <w:rPr>
+          <w:color w:val="000000"/>
+          <w:sz w:val="28"/>
+          <w:szCs w:val="28"/>
+        </w:rPr>
+      </w:pPr>
+      <w:r>
+        <w:rPr>
+          <w:b/>
+          <w:bCs/>
+          <w:color w:val="000000"/>
+          <w:sz w:val="28"/>
+          <w:szCs w:val="28"/>
+        </w:rPr>
+        <w:t>Опис:</w:t>
+      </w:r>
+      <w:r>
+        <w:rPr>
+          <w:color w:val="000000"/>
+          <w:sz w:val="28"/>
+          <w:szCs w:val="28"/>
+        </w:rPr>
+        <w:t xml:space="preserve"> Виконує повторні спроби для подолання тимчасових збоїв перед переходом до резервного рішення.</w:t>
+      </w:r>
+    </w:p>
+    <w:p>
+      <w:pPr>
+        <w:numPr>
+          <w:ilvl w:val="0"/>
+          <w:numId w:val="34"/>
+        </w:numPr>
+        <w:spacing w:line="360" w:lineRule="auto"/>
+        <w:ind w:left="0" w:firstLine="709"/>
+        <w:jc w:val="both"/>
+        <w:rPr>
+          <w:color w:val="000000"/>
+          <w:sz w:val="28"/>
+          <w:szCs w:val="28"/>
+        </w:rPr>
+      </w:pPr>
+      <w:r>
+        <w:rPr>
+          <w:b/>
+          <w:bCs/>
+          <w:color w:val="000000"/>
+          <w:sz w:val="28"/>
+          <w:szCs w:val="28"/>
+        </w:rPr>
+        <w:t>Cache Fallback (Cache-Aside Pattern)</w:t>
+      </w:r>
+      <w:r>
+        <w:rPr>
+          <w:color w:val="000000"/>
+          <w:sz w:val="28"/>
+          <w:szCs w:val="28"/>
+        </w:rPr>
+        <w:t xml:space="preserve"> </w:t>
+      </w:r>
+    </w:p>
+    <w:p>
+      <w:pPr>
+        <w:spacing w:line="360" w:lineRule="auto"/>
+        <w:ind w:firstLine="709"/>
+        <w:jc w:val="both"/>
+        <w:rPr>
+          <w:color w:val="000000"/>
+          <w:sz w:val="28"/>
+          <w:szCs w:val="28"/>
+        </w:rPr>
+      </w:pPr>
+      <w:r>
+        <w:rPr>
+          <w:b/>
+          <w:bCs/>
+          <w:color w:val="000000"/>
+          <w:sz w:val="28"/>
+          <w:szCs w:val="28"/>
+        </w:rPr>
+        <w:t>Опис:</w:t>
+      </w:r>
+      <w:r>
+        <w:rPr>
+          <w:color w:val="000000"/>
+          <w:sz w:val="28"/>
+          <w:szCs w:val="28"/>
+        </w:rPr>
+        <w:t xml:space="preserve"> Використовує кешовані дані з Redis як резервний варіант, коли основний сервіс недоступний.</w:t>
+      </w:r>
     </w:p>
     <w:p>
       <w:pPr>
@@ -2995,7 +4102,6 @@
           <w:color w:val="000000" w:themeColor="text1"/>
           <w:sz w:val="28"/>
           <w:szCs w:val="28"/>
-          <w:lang w:val="uk-UA"/>
         </w:rPr>
       </w:pPr>
       <w:r>
@@ -3003,85 +4109,8 @@
           <w:color w:val="000000" w:themeColor="text1"/>
           <w:sz w:val="28"/>
           <w:szCs w:val="28"/>
-          <w:lang w:val="uk-UA"/>
-        </w:rPr>
-        <w:t>У ході виконання лабораторної роботи було проведено високорівневе планування потужностей для всіх компонентів стрімінгового сервісу, призначеного для обслуговування до 100 000 одночасно активних користувачів. Було визначено навантаження на кожен мікросервіс, базу даних, систему кешування, брокер повідомлень та платформу потокової обробки, а також підібрано оптимальні конфігурації серверів і орієнтовну вартість їх використання у хмарному середовищі.</w:t>
-      </w:r>
-    </w:p>
-    <w:p>
-      <w:pPr>
-        <w:pStyle w:val="NormalWeb"/>
-        <w:snapToGrid w:val="0"/>
-        <w:spacing w:line="360" w:lineRule="auto"/>
-        <w:ind w:firstLine="709"/>
-        <w:contextualSpacing/>
-        <w:jc w:val="both"/>
-        <w:rPr>
-          <w:color w:val="000000" w:themeColor="text1"/>
-          <w:sz w:val="28"/>
-          <w:szCs w:val="28"/>
-          <w:lang w:val="uk-UA"/>
-        </w:rPr>
-      </w:pPr>
-      <w:r>
-        <w:rPr>
-          <w:color w:val="000000" w:themeColor="text1"/>
-          <w:sz w:val="28"/>
-          <w:szCs w:val="28"/>
-          <w:lang w:val="uk-UA"/>
-        </w:rPr>
-        <w:t>Для кожного компоненту системи було обґрунтовано відповідний тип масштабування. Основні мікросервіси масштабуються горизонтально з використанням Kubernetes та Ingress Controller, що забезпечує гнучке та надійне балансування навантаження. Kafka та Flink масштабуються кластерно — за рахунок розподілу партицій і задач між брокерами та виконавцями. Redis передбачає переважно вертикальне масштабування із можливістю використання шардінгу. PostgreSQL масштабовано вертикально для обробки транзакцій та горизонтально за рахунок використання read-replicas для читання.</w:t>
-      </w:r>
-    </w:p>
-    <w:p>
-      <w:pPr>
-        <w:pStyle w:val="NormalWeb"/>
-        <w:snapToGrid w:val="0"/>
-        <w:spacing w:line="360" w:lineRule="auto"/>
-        <w:ind w:firstLine="709"/>
-        <w:contextualSpacing/>
-        <w:jc w:val="both"/>
-        <w:rPr>
-          <w:color w:val="000000" w:themeColor="text1"/>
-          <w:sz w:val="28"/>
-          <w:szCs w:val="28"/>
-          <w:lang w:val="uk-UA"/>
-        </w:rPr>
-      </w:pPr>
-      <w:r>
-        <w:rPr>
-          <w:color w:val="000000" w:themeColor="text1"/>
-          <w:sz w:val="28"/>
-          <w:szCs w:val="28"/>
-          <w:lang w:val="uk-UA"/>
-        </w:rPr>
-        <w:t>Було чітко сформульовано причини застосування кожного типу масштабування, виходячи з практичних сценаріїв роботи системи — таких як велика кількість одночасних потоків, висока частота запитів до кешу, потреба в обробці подій у реальному часі, або навантаження на базу даних. Для кожного випадку було описано механізм балансування — від HTTP-роутингів до розподілу Kafka-партицій і Flink task slot'ів.</w:t>
-      </w:r>
-    </w:p>
-    <w:p>
-      <w:pPr>
-        <w:pStyle w:val="NormalWeb"/>
-        <w:snapToGrid w:val="0"/>
-        <w:spacing w:line="360" w:lineRule="auto"/>
-        <w:ind w:firstLine="709"/>
-        <w:contextualSpacing/>
-        <w:jc w:val="both"/>
-        <w:rPr>
-          <w:color w:val="000000" w:themeColor="text1"/>
-          <w:sz w:val="28"/>
-          <w:szCs w:val="28"/>
-          <w:lang w:val="uk-UA"/>
-        </w:rPr>
-      </w:pPr>
-      <w:r>
-        <w:rPr>
-          <w:color w:val="000000" w:themeColor="text1"/>
-          <w:sz w:val="28"/>
-          <w:szCs w:val="28"/>
-          <w:lang w:val="uk-UA"/>
-        </w:rPr>
-        <w:lastRenderedPageBreak/>
-        <w:t>Загалом робота підтвердила, що правильно обране масштабування є критично важливим для побудови стабільної, високопродуктивної, відмовостійкої та масштабованої архітектури сучасного стрімінгового сервісу.</w:t>
+        </w:rPr>
+        <w:t>У роботі ідентифіковано ключові потенційні відмови стрімінгової системи та розроблено рішення для критичної проблеми — відмови Streaming Service. Обраний підхід з Circuit Breaker, повторними спробами та кешуванням забезпечує баланс між вартістю, часом реалізації та надійністю. Діаграма послідовностей демонструє процес обробки відмови, а використані патерни (Circuit Breaker, Retry, Cache Fallback) відповідають сучасним практикам підвищення відмовостійкості.</w:t>
       </w:r>
     </w:p>
     <w:p>
@@ -3339,6 +4368,155 @@
     </w:lvl>
   </w:abstractNum>
   <w:abstractNum w:abstractNumId="2" w15:restartNumberingAfterBreak="0">
+    <w:nsid w:val="0A1C0366"/>
+    <w:multiLevelType w:val="multilevel"/>
+    <w:tmpl w:val="F84E8884"/>
+    <w:lvl w:ilvl="0">
+      <w:start w:val="1"/>
+      <w:numFmt w:val="bullet"/>
+      <w:lvlText w:val=""/>
+      <w:lvlJc w:val="left"/>
+      <w:pPr>
+        <w:tabs>
+          <w:tab w:val="num" w:pos="720"/>
+        </w:tabs>
+        <w:ind w:left="720" w:hanging="360"/>
+      </w:pPr>
+      <w:rPr>
+        <w:rFonts w:ascii="Symbol" w:hAnsi="Symbol" w:hint="default"/>
+        <w:sz w:val="20"/>
+      </w:rPr>
+    </w:lvl>
+    <w:lvl w:ilvl="1">
+      <w:start w:val="1"/>
+      <w:numFmt w:val="bullet"/>
+      <w:lvlText w:val="o"/>
+      <w:lvlJc w:val="left"/>
+      <w:pPr>
+        <w:tabs>
+          <w:tab w:val="num" w:pos="1440"/>
+        </w:tabs>
+        <w:ind w:left="1440" w:hanging="360"/>
+      </w:pPr>
+      <w:rPr>
+        <w:rFonts w:ascii="Courier New" w:hAnsi="Courier New" w:hint="default"/>
+        <w:sz w:val="20"/>
+      </w:rPr>
+    </w:lvl>
+    <w:lvl w:ilvl="2" w:tentative="1">
+      <w:start w:val="1"/>
+      <w:numFmt w:val="bullet"/>
+      <w:lvlText w:val=""/>
+      <w:lvlJc w:val="left"/>
+      <w:pPr>
+        <w:tabs>
+          <w:tab w:val="num" w:pos="2160"/>
+        </w:tabs>
+        <w:ind w:left="2160" w:hanging="360"/>
+      </w:pPr>
+      <w:rPr>
+        <w:rFonts w:ascii="Wingdings" w:hAnsi="Wingdings" w:hint="default"/>
+        <w:sz w:val="20"/>
+      </w:rPr>
+    </w:lvl>
+    <w:lvl w:ilvl="3" w:tentative="1">
+      <w:start w:val="1"/>
+      <w:numFmt w:val="bullet"/>
+      <w:lvlText w:val=""/>
+      <w:lvlJc w:val="left"/>
+      <w:pPr>
+        <w:tabs>
+          <w:tab w:val="num" w:pos="2880"/>
+        </w:tabs>
+        <w:ind w:left="2880" w:hanging="360"/>
+      </w:pPr>
+      <w:rPr>
+        <w:rFonts w:ascii="Wingdings" w:hAnsi="Wingdings" w:hint="default"/>
+        <w:sz w:val="20"/>
+      </w:rPr>
+    </w:lvl>
+    <w:lvl w:ilvl="4" w:tentative="1">
+      <w:start w:val="1"/>
+      <w:numFmt w:val="bullet"/>
+      <w:lvlText w:val=""/>
+      <w:lvlJc w:val="left"/>
+      <w:pPr>
+        <w:tabs>
+          <w:tab w:val="num" w:pos="3600"/>
+        </w:tabs>
+        <w:ind w:left="3600" w:hanging="360"/>
+      </w:pPr>
+      <w:rPr>
+        <w:rFonts w:ascii="Wingdings" w:hAnsi="Wingdings" w:hint="default"/>
+        <w:sz w:val="20"/>
+      </w:rPr>
+    </w:lvl>
+    <w:lvl w:ilvl="5" w:tentative="1">
+      <w:start w:val="1"/>
+      <w:numFmt w:val="bullet"/>
+      <w:lvlText w:val=""/>
+      <w:lvlJc w:val="left"/>
+      <w:pPr>
+        <w:tabs>
+          <w:tab w:val="num" w:pos="4320"/>
+        </w:tabs>
+        <w:ind w:left="4320" w:hanging="360"/>
+      </w:pPr>
+      <w:rPr>
+        <w:rFonts w:ascii="Wingdings" w:hAnsi="Wingdings" w:hint="default"/>
+        <w:sz w:val="20"/>
+      </w:rPr>
+    </w:lvl>
+    <w:lvl w:ilvl="6" w:tentative="1">
+      <w:start w:val="1"/>
+      <w:numFmt w:val="bullet"/>
+      <w:lvlText w:val=""/>
+      <w:lvlJc w:val="left"/>
+      <w:pPr>
+        <w:tabs>
+          <w:tab w:val="num" w:pos="5040"/>
+        </w:tabs>
+        <w:ind w:left="5040" w:hanging="360"/>
+      </w:pPr>
+      <w:rPr>
+        <w:rFonts w:ascii="Wingdings" w:hAnsi="Wingdings" w:hint="default"/>
+        <w:sz w:val="20"/>
+      </w:rPr>
+    </w:lvl>
+    <w:lvl w:ilvl="7" w:tentative="1">
+      <w:start w:val="1"/>
+      <w:numFmt w:val="bullet"/>
+      <w:lvlText w:val=""/>
+      <w:lvlJc w:val="left"/>
+      <w:pPr>
+        <w:tabs>
+          <w:tab w:val="num" w:pos="5760"/>
+        </w:tabs>
+        <w:ind w:left="5760" w:hanging="360"/>
+      </w:pPr>
+      <w:rPr>
+        <w:rFonts w:ascii="Wingdings" w:hAnsi="Wingdings" w:hint="default"/>
+        <w:sz w:val="20"/>
+      </w:rPr>
+    </w:lvl>
+    <w:lvl w:ilvl="8" w:tentative="1">
+      <w:start w:val="1"/>
+      <w:numFmt w:val="bullet"/>
+      <w:lvlText w:val=""/>
+      <w:lvlJc w:val="left"/>
+      <w:pPr>
+        <w:tabs>
+          <w:tab w:val="num" w:pos="6480"/>
+        </w:tabs>
+        <w:ind w:left="6480" w:hanging="360"/>
+      </w:pPr>
+      <w:rPr>
+        <w:rFonts w:ascii="Wingdings" w:hAnsi="Wingdings" w:hint="default"/>
+        <w:sz w:val="20"/>
+      </w:rPr>
+    </w:lvl>
+  </w:abstractNum>
+  <w:abstractNum w:abstractNumId="3" w15:restartNumberingAfterBreak="0">
     <w:nsid w:val="0D343D33"/>
     <w:multiLevelType w:val="multilevel"/>
     <w:tmpl w:val="0E8EDA68"/>
@@ -3487,7 +4665,7 @@
       </w:rPr>
     </w:lvl>
   </w:abstractNum>
-  <w:abstractNum w:abstractNumId="3" w15:restartNumberingAfterBreak="0">
+  <w:abstractNum w:abstractNumId="4" w15:restartNumberingAfterBreak="0">
     <w:nsid w:val="14DB4063"/>
     <w:multiLevelType w:val="multilevel"/>
     <w:tmpl w:val="C164C626"/>
@@ -3636,7 +4814,7 @@
       </w:rPr>
     </w:lvl>
   </w:abstractNum>
-  <w:abstractNum w:abstractNumId="4" w15:restartNumberingAfterBreak="0">
+  <w:abstractNum w:abstractNumId="5" w15:restartNumberingAfterBreak="0">
     <w:nsid w:val="188B52AA"/>
     <w:multiLevelType w:val="multilevel"/>
     <w:tmpl w:val="186E9300"/>
@@ -3785,7 +4963,7 @@
       </w:rPr>
     </w:lvl>
   </w:abstractNum>
-  <w:abstractNum w:abstractNumId="5" w15:restartNumberingAfterBreak="0">
+  <w:abstractNum w:abstractNumId="6" w15:restartNumberingAfterBreak="0">
     <w:nsid w:val="217C52FB"/>
     <w:multiLevelType w:val="multilevel"/>
     <w:tmpl w:val="5FD4BFB6"/>
@@ -3898,7 +5076,7 @@
       </w:rPr>
     </w:lvl>
   </w:abstractNum>
-  <w:abstractNum w:abstractNumId="6" w15:restartNumberingAfterBreak="0">
+  <w:abstractNum w:abstractNumId="7" w15:restartNumberingAfterBreak="0">
     <w:nsid w:val="265B2A65"/>
     <w:multiLevelType w:val="hybridMultilevel"/>
     <w:tmpl w:val="1E248D2E"/>
@@ -3987,7 +5165,7 @@
       </w:pPr>
     </w:lvl>
   </w:abstractNum>
-  <w:abstractNum w:abstractNumId="7" w15:restartNumberingAfterBreak="0">
+  <w:abstractNum w:abstractNumId="8" w15:restartNumberingAfterBreak="0">
     <w:nsid w:val="27B6361D"/>
     <w:multiLevelType w:val="multilevel"/>
     <w:tmpl w:val="B978BFB4"/>
@@ -4134,7 +5312,7 @@
       </w:rPr>
     </w:lvl>
   </w:abstractNum>
-  <w:abstractNum w:abstractNumId="8" w15:restartNumberingAfterBreak="0">
+  <w:abstractNum w:abstractNumId="9" w15:restartNumberingAfterBreak="0">
     <w:nsid w:val="283F2F1E"/>
     <w:multiLevelType w:val="multilevel"/>
     <w:tmpl w:val="33048682"/>
@@ -4248,7 +5426,7 @@
       </w:pPr>
     </w:lvl>
   </w:abstractNum>
-  <w:abstractNum w:abstractNumId="9" w15:restartNumberingAfterBreak="0">
+  <w:abstractNum w:abstractNumId="10" w15:restartNumberingAfterBreak="0">
     <w:nsid w:val="2A3E4187"/>
     <w:multiLevelType w:val="multilevel"/>
     <w:tmpl w:val="33048682"/>
@@ -4362,7 +5540,7 @@
       </w:pPr>
     </w:lvl>
   </w:abstractNum>
-  <w:abstractNum w:abstractNumId="10" w15:restartNumberingAfterBreak="0">
+  <w:abstractNum w:abstractNumId="11" w15:restartNumberingAfterBreak="0">
     <w:nsid w:val="2B77240D"/>
     <w:multiLevelType w:val="multilevel"/>
     <w:tmpl w:val="33048682"/>
@@ -4475,7 +5653,7 @@
       </w:pPr>
     </w:lvl>
   </w:abstractNum>
-  <w:abstractNum w:abstractNumId="11" w15:restartNumberingAfterBreak="0">
+  <w:abstractNum w:abstractNumId="12" w15:restartNumberingAfterBreak="0">
     <w:nsid w:val="3020672F"/>
     <w:multiLevelType w:val="multilevel"/>
     <w:tmpl w:val="33048682"/>
@@ -4588,7 +5766,7 @@
       </w:pPr>
     </w:lvl>
   </w:abstractNum>
-  <w:abstractNum w:abstractNumId="12" w15:restartNumberingAfterBreak="0">
+  <w:abstractNum w:abstractNumId="13" w15:restartNumberingAfterBreak="0">
     <w:nsid w:val="407627F1"/>
     <w:multiLevelType w:val="multilevel"/>
     <w:tmpl w:val="E1A88162"/>
@@ -4701,7 +5879,7 @@
       </w:rPr>
     </w:lvl>
   </w:abstractNum>
-  <w:abstractNum w:abstractNumId="13" w15:restartNumberingAfterBreak="0">
+  <w:abstractNum w:abstractNumId="14" w15:restartNumberingAfterBreak="0">
     <w:nsid w:val="44180FD3"/>
     <w:multiLevelType w:val="multilevel"/>
     <w:tmpl w:val="8DFECF50"/>
@@ -4815,7 +5993,7 @@
       </w:pPr>
     </w:lvl>
   </w:abstractNum>
-  <w:abstractNum w:abstractNumId="14" w15:restartNumberingAfterBreak="0">
+  <w:abstractNum w:abstractNumId="15" w15:restartNumberingAfterBreak="0">
     <w:nsid w:val="4AC52BAB"/>
     <w:multiLevelType w:val="multilevel"/>
     <w:tmpl w:val="8D48A270"/>
@@ -4929,7 +6107,7 @@
       </w:pPr>
     </w:lvl>
   </w:abstractNum>
-  <w:abstractNum w:abstractNumId="15" w15:restartNumberingAfterBreak="0">
+  <w:abstractNum w:abstractNumId="16" w15:restartNumberingAfterBreak="0">
     <w:nsid w:val="4C797AD0"/>
     <w:multiLevelType w:val="multilevel"/>
     <w:tmpl w:val="7FB015D0"/>
@@ -5078,7 +6256,7 @@
       </w:rPr>
     </w:lvl>
   </w:abstractNum>
-  <w:abstractNum w:abstractNumId="16" w15:restartNumberingAfterBreak="0">
+  <w:abstractNum w:abstractNumId="17" w15:restartNumberingAfterBreak="0">
     <w:nsid w:val="529D162E"/>
     <w:multiLevelType w:val="multilevel"/>
     <w:tmpl w:val="0809001F"/>
@@ -5164,7 +6342,7 @@
       </w:pPr>
     </w:lvl>
   </w:abstractNum>
-  <w:abstractNum w:abstractNumId="17" w15:restartNumberingAfterBreak="0">
+  <w:abstractNum w:abstractNumId="18" w15:restartNumberingAfterBreak="0">
     <w:nsid w:val="52AB2E68"/>
     <w:multiLevelType w:val="multilevel"/>
     <w:tmpl w:val="EFF40BA8"/>
@@ -5313,7 +6491,7 @@
       </w:rPr>
     </w:lvl>
   </w:abstractNum>
-  <w:abstractNum w:abstractNumId="18" w15:restartNumberingAfterBreak="0">
+  <w:abstractNum w:abstractNumId="19" w15:restartNumberingAfterBreak="0">
     <w:nsid w:val="55415C4B"/>
     <w:multiLevelType w:val="multilevel"/>
     <w:tmpl w:val="33048682"/>
@@ -5426,7 +6604,7 @@
       </w:pPr>
     </w:lvl>
   </w:abstractNum>
-  <w:abstractNum w:abstractNumId="19" w15:restartNumberingAfterBreak="0">
+  <w:abstractNum w:abstractNumId="20" w15:restartNumberingAfterBreak="0">
     <w:nsid w:val="591C3FA1"/>
     <w:multiLevelType w:val="multilevel"/>
     <w:tmpl w:val="6A70DAE6"/>
@@ -5575,7 +6753,7 @@
       </w:rPr>
     </w:lvl>
   </w:abstractNum>
-  <w:abstractNum w:abstractNumId="20" w15:restartNumberingAfterBreak="0">
+  <w:abstractNum w:abstractNumId="21" w15:restartNumberingAfterBreak="0">
     <w:nsid w:val="594907BF"/>
     <w:multiLevelType w:val="multilevel"/>
     <w:tmpl w:val="DB24AAB0"/>
@@ -5724,7 +6902,7 @@
       </w:rPr>
     </w:lvl>
   </w:abstractNum>
-  <w:abstractNum w:abstractNumId="21" w15:restartNumberingAfterBreak="0">
+  <w:abstractNum w:abstractNumId="22" w15:restartNumberingAfterBreak="0">
     <w:nsid w:val="629A78D6"/>
     <w:multiLevelType w:val="multilevel"/>
     <w:tmpl w:val="02B2D634"/>
@@ -5873,7 +7051,7 @@
       </w:rPr>
     </w:lvl>
   </w:abstractNum>
-  <w:abstractNum w:abstractNumId="22" w15:restartNumberingAfterBreak="0">
+  <w:abstractNum w:abstractNumId="23" w15:restartNumberingAfterBreak="0">
     <w:nsid w:val="691B797E"/>
     <w:multiLevelType w:val="multilevel"/>
     <w:tmpl w:val="33048682"/>
@@ -5986,7 +7164,7 @@
       </w:pPr>
     </w:lvl>
   </w:abstractNum>
-  <w:abstractNum w:abstractNumId="23" w15:restartNumberingAfterBreak="0">
+  <w:abstractNum w:abstractNumId="24" w15:restartNumberingAfterBreak="0">
     <w:nsid w:val="69971BA7"/>
     <w:multiLevelType w:val="multilevel"/>
     <w:tmpl w:val="33048682"/>
@@ -6099,7 +7277,7 @@
       </w:pPr>
     </w:lvl>
   </w:abstractNum>
-  <w:abstractNum w:abstractNumId="24" w15:restartNumberingAfterBreak="0">
+  <w:abstractNum w:abstractNumId="25" w15:restartNumberingAfterBreak="0">
     <w:nsid w:val="6F0D0E3C"/>
     <w:multiLevelType w:val="multilevel"/>
     <w:tmpl w:val="6A141382"/>
@@ -6248,7 +7426,7 @@
       </w:rPr>
     </w:lvl>
   </w:abstractNum>
-  <w:abstractNum w:abstractNumId="25" w15:restartNumberingAfterBreak="0">
+  <w:abstractNum w:abstractNumId="26" w15:restartNumberingAfterBreak="0">
     <w:nsid w:val="71214A0E"/>
     <w:multiLevelType w:val="multilevel"/>
     <w:tmpl w:val="33048682"/>
@@ -6366,7 +7544,7 @@
       </w:pPr>
     </w:lvl>
   </w:abstractNum>
-  <w:abstractNum w:abstractNumId="26" w15:restartNumberingAfterBreak="0">
+  <w:abstractNum w:abstractNumId="27" w15:restartNumberingAfterBreak="0">
     <w:nsid w:val="769A3819"/>
     <w:multiLevelType w:val="multilevel"/>
     <w:tmpl w:val="33048682"/>
@@ -6484,7 +7662,7 @@
       </w:pPr>
     </w:lvl>
   </w:abstractNum>
-  <w:abstractNum w:abstractNumId="27" w15:restartNumberingAfterBreak="0">
+  <w:abstractNum w:abstractNumId="28" w15:restartNumberingAfterBreak="0">
     <w:nsid w:val="774F72E2"/>
     <w:multiLevelType w:val="multilevel"/>
     <w:tmpl w:val="167E5C0A"/>
@@ -6597,7 +7775,7 @@
       </w:rPr>
     </w:lvl>
   </w:abstractNum>
-  <w:abstractNum w:abstractNumId="28" w15:restartNumberingAfterBreak="0">
+  <w:abstractNum w:abstractNumId="29" w15:restartNumberingAfterBreak="0">
     <w:nsid w:val="7B4A0D06"/>
     <w:multiLevelType w:val="multilevel"/>
     <w:tmpl w:val="33048682"/>
@@ -6710,7 +7888,124 @@
       </w:pPr>
     </w:lvl>
   </w:abstractNum>
-  <w:abstractNum w:abstractNumId="29" w15:restartNumberingAfterBreak="0">
+  <w:abstractNum w:abstractNumId="30" w15:restartNumberingAfterBreak="0">
+    <w:nsid w:val="7BE14C0F"/>
+    <w:multiLevelType w:val="multilevel"/>
+    <w:tmpl w:val="33048682"/>
+    <w:lvl w:ilvl="0">
+      <w:start w:val="1"/>
+      <w:numFmt w:val="decimal"/>
+      <w:lvlText w:val="%1."/>
+      <w:lvlJc w:val="left"/>
+      <w:pPr>
+        <w:tabs>
+          <w:tab w:val="num" w:pos="720"/>
+        </w:tabs>
+        <w:ind w:left="720" w:hanging="360"/>
+      </w:pPr>
+    </w:lvl>
+    <w:lvl w:ilvl="1">
+      <w:start w:val="1"/>
+      <w:numFmt w:val="bullet"/>
+      <w:lvlText w:val="o"/>
+      <w:lvlJc w:val="left"/>
+      <w:pPr>
+        <w:tabs>
+          <w:tab w:val="num" w:pos="1440"/>
+        </w:tabs>
+        <w:ind w:left="1440" w:hanging="360"/>
+      </w:pPr>
+      <w:rPr>
+        <w:rFonts w:ascii="Courier New" w:hAnsi="Courier New" w:hint="default"/>
+        <w:sz w:val="20"/>
+      </w:rPr>
+    </w:lvl>
+    <w:lvl w:ilvl="2" w:tentative="1">
+      <w:start w:val="1"/>
+      <w:numFmt w:val="decimal"/>
+      <w:lvlText w:val="%3."/>
+      <w:lvlJc w:val="left"/>
+      <w:pPr>
+        <w:tabs>
+          <w:tab w:val="num" w:pos="2160"/>
+        </w:tabs>
+        <w:ind w:left="2160" w:hanging="360"/>
+      </w:pPr>
+    </w:lvl>
+    <w:lvl w:ilvl="3" w:tentative="1">
+      <w:start w:val="1"/>
+      <w:numFmt w:val="decimal"/>
+      <w:lvlText w:val="%4."/>
+      <w:lvlJc w:val="left"/>
+      <w:pPr>
+        <w:tabs>
+          <w:tab w:val="num" w:pos="2880"/>
+        </w:tabs>
+        <w:ind w:left="2880" w:hanging="360"/>
+      </w:pPr>
+    </w:lvl>
+    <w:lvl w:ilvl="4" w:tentative="1">
+      <w:start w:val="1"/>
+      <w:numFmt w:val="decimal"/>
+      <w:lvlText w:val="%5."/>
+      <w:lvlJc w:val="left"/>
+      <w:pPr>
+        <w:tabs>
+          <w:tab w:val="num" w:pos="3600"/>
+        </w:tabs>
+        <w:ind w:left="3600" w:hanging="360"/>
+      </w:pPr>
+    </w:lvl>
+    <w:lvl w:ilvl="5" w:tentative="1">
+      <w:start w:val="1"/>
+      <w:numFmt w:val="decimal"/>
+      <w:lvlText w:val="%6."/>
+      <w:lvlJc w:val="left"/>
+      <w:pPr>
+        <w:tabs>
+          <w:tab w:val="num" w:pos="4320"/>
+        </w:tabs>
+        <w:ind w:left="4320" w:hanging="360"/>
+      </w:pPr>
+    </w:lvl>
+    <w:lvl w:ilvl="6" w:tentative="1">
+      <w:start w:val="1"/>
+      <w:numFmt w:val="decimal"/>
+      <w:lvlText w:val="%7."/>
+      <w:lvlJc w:val="left"/>
+      <w:pPr>
+        <w:tabs>
+          <w:tab w:val="num" w:pos="5040"/>
+        </w:tabs>
+        <w:ind w:left="5040" w:hanging="360"/>
+      </w:pPr>
+    </w:lvl>
+    <w:lvl w:ilvl="7" w:tentative="1">
+      <w:start w:val="1"/>
+      <w:numFmt w:val="decimal"/>
+      <w:lvlText w:val="%8."/>
+      <w:lvlJc w:val="left"/>
+      <w:pPr>
+        <w:tabs>
+          <w:tab w:val="num" w:pos="5760"/>
+        </w:tabs>
+        <w:ind w:left="5760" w:hanging="360"/>
+      </w:pPr>
+    </w:lvl>
+    <w:lvl w:ilvl="8" w:tentative="1">
+      <w:start w:val="1"/>
+      <w:numFmt w:val="decimal"/>
+      <w:lvlText w:val="%9."/>
+      <w:lvlJc w:val="left"/>
+      <w:pPr>
+        <w:tabs>
+          <w:tab w:val="num" w:pos="6480"/>
+        </w:tabs>
+        <w:ind w:left="6480" w:hanging="360"/>
+      </w:pPr>
+    </w:lvl>
+  </w:abstractNum>
+  <w:abstractNum w:abstractNumId="31" w15:restartNumberingAfterBreak="0">
     <w:nsid w:val="7D1C7088"/>
     <w:multiLevelType w:val="multilevel"/>
     <w:tmpl w:val="33048682"/>
@@ -6824,40 +8119,40 @@
     </w:lvl>
   </w:abstractNum>
   <w:num w:numId="1">
+    <w:abstractNumId w:val="6"/>
+  </w:num>
+  <w:num w:numId="2">
+    <w:abstractNumId w:val="23"/>
+  </w:num>
+  <w:num w:numId="3">
+    <w:abstractNumId w:val="21"/>
+  </w:num>
+  <w:num w:numId="4">
+    <w:abstractNumId w:val="16"/>
+  </w:num>
+  <w:num w:numId="5">
     <w:abstractNumId w:val="5"/>
   </w:num>
-  <w:num w:numId="2">
+  <w:num w:numId="6">
+    <w:abstractNumId w:val="25"/>
+  </w:num>
+  <w:num w:numId="7">
+    <w:abstractNumId w:val="20"/>
+  </w:num>
+  <w:num w:numId="8">
+    <w:abstractNumId w:val="8"/>
+  </w:num>
+  <w:num w:numId="9">
     <w:abstractNumId w:val="22"/>
   </w:num>
-  <w:num w:numId="3">
-    <w:abstractNumId w:val="20"/>
+  <w:num w:numId="10">
+    <w:abstractNumId w:val="3"/>
   </w:num>
-  <w:num w:numId="4">
-    <w:abstractNumId w:val="15"/>
-  </w:num>
-  <w:num w:numId="5">
-    <w:abstractNumId w:val="4"/>
-  </w:num>
-  <w:num w:numId="6">
-    <w:abstractNumId w:val="24"/>
-  </w:num>
-  <w:num w:numId="7">
+  <w:num w:numId="11">
     <w:abstractNumId w:val="19"/>
   </w:num>
-  <w:num w:numId="8">
-    <w:abstractNumId w:val="7"/>
-  </w:num>
-  <w:num w:numId="9">
-    <w:abstractNumId w:val="21"/>
-  </w:num>
-  <w:num w:numId="10">
-    <w:abstractNumId w:val="2"/>
-  </w:num>
-  <w:num w:numId="11">
-    <w:abstractNumId w:val="18"/>
-  </w:num>
   <w:num w:numId="12">
-    <w:abstractNumId w:val="18"/>
+    <w:abstractNumId w:val="19"/>
     <w:lvlOverride w:ilvl="0">
       <w:lvl w:ilvl="0">
         <w:start w:val="1"/>
@@ -6986,29 +8281,29 @@
     </w:lvlOverride>
   </w:num>
   <w:num w:numId="13">
-    <w:abstractNumId w:val="10"/>
+    <w:abstractNumId w:val="11"/>
   </w:num>
   <w:num w:numId="14">
-    <w:abstractNumId w:val="10"/>
+    <w:abstractNumId w:val="11"/>
     <w:lvlOverride w:ilvl="0"/>
   </w:num>
   <w:num w:numId="15">
-    <w:abstractNumId w:val="28"/>
+    <w:abstractNumId w:val="29"/>
   </w:num>
   <w:num w:numId="16">
-    <w:abstractNumId w:val="12"/>
+    <w:abstractNumId w:val="13"/>
   </w:num>
   <w:num w:numId="17">
-    <w:abstractNumId w:val="16"/>
+    <w:abstractNumId w:val="17"/>
   </w:num>
   <w:num w:numId="18">
-    <w:abstractNumId w:val="6"/>
+    <w:abstractNumId w:val="7"/>
   </w:num>
   <w:num w:numId="19">
-    <w:abstractNumId w:val="23"/>
+    <w:abstractNumId w:val="24"/>
   </w:num>
   <w:num w:numId="20">
-    <w:abstractNumId w:val="27"/>
+    <w:abstractNumId w:val="28"/>
   </w:num>
   <w:num w:numId="21">
     <w:abstractNumId w:val="0"/>
@@ -7017,16 +8312,16 @@
     <w:abstractNumId w:val="1"/>
   </w:num>
   <w:num w:numId="23">
-    <w:abstractNumId w:val="3"/>
+    <w:abstractNumId w:val="4"/>
   </w:num>
   <w:num w:numId="24">
+    <w:abstractNumId w:val="10"/>
+  </w:num>
+  <w:num w:numId="25">
     <w:abstractNumId w:val="9"/>
   </w:num>
-  <w:num w:numId="25">
-    <w:abstractNumId w:val="8"/>
-  </w:num>
   <w:num w:numId="26">
-    <w:abstractNumId w:val="11"/>
+    <w:abstractNumId w:val="12"/>
     <w:lvlOverride w:ilvl="0">
       <w:lvl w:ilvl="0">
         <w:numFmt w:val="lowerLetter"/>
@@ -7036,22 +8331,28 @@
     </w:lvlOverride>
   </w:num>
   <w:num w:numId="27">
-    <w:abstractNumId w:val="29"/>
+    <w:abstractNumId w:val="31"/>
   </w:num>
   <w:num w:numId="28">
+    <w:abstractNumId w:val="15"/>
+  </w:num>
+  <w:num w:numId="29">
+    <w:abstractNumId w:val="26"/>
+  </w:num>
+  <w:num w:numId="30">
     <w:abstractNumId w:val="14"/>
   </w:num>
-  <w:num w:numId="29">
-    <w:abstractNumId w:val="25"/>
-  </w:num>
-  <w:num w:numId="30">
-    <w:abstractNumId w:val="13"/>
-  </w:num>
   <w:num w:numId="31">
-    <w:abstractNumId w:val="26"/>
+    <w:abstractNumId w:val="27"/>
   </w:num>
   <w:num w:numId="32">
-    <w:abstractNumId w:val="17"/>
+    <w:abstractNumId w:val="18"/>
+  </w:num>
+  <w:num w:numId="33">
+    <w:abstractNumId w:val="2"/>
+  </w:num>
+  <w:num w:numId="34">
+    <w:abstractNumId w:val="30"/>
   </w:num>
   <w:numIdMacAtCleanup w:val="10"/>
 </w:numbering>

</xml_diff>